<commit_message>
feat(platform):provision Amazon EKS production cluster and bootstrap EKS cluster with Metrics Server and Pod Identity Agent -feat(storage): implement Amazon EBS CSI Driver with EKS Pod Identity
</commit_message>
<xml_diff>
--- a/docs/retail-store-v2-validation-screenshots.docx
+++ b/docs/retail-store-v2-validation-screenshots.docx
@@ -805,11 +805,15 @@
       <w:r>
         <w:rPr>
           <w:noProof/>
+          <w:highlight w:val="yellow"/>
         </w:rPr>
         <w:lastRenderedPageBreak/>
         <w:t>provision Amazon EKS production cluster</w:t>
       </w:r>
       <w:r>
+        <w:rPr>
+          <w:noProof/>
+        </w:rPr>
         <w:drawing>
           <wp:inline distT="0" distB="0" distL="0" distR="0" wp14:anchorId="3FD29C89" wp14:editId="2C0DD4DD">
             <wp:extent cx="6497932" cy="3388505"/>
@@ -849,6 +853,9 @@
     </w:p>
     <w:p>
       <w:r>
+        <w:rPr>
+          <w:noProof/>
+        </w:rPr>
         <w:drawing>
           <wp:inline distT="0" distB="0" distL="0" distR="0" wp14:anchorId="4E81ED5E" wp14:editId="487D227B">
             <wp:extent cx="5943600" cy="1406525"/>
@@ -888,6 +895,9 @@
     </w:p>
     <w:p>
       <w:r>
+        <w:rPr>
+          <w:noProof/>
+        </w:rPr>
         <w:drawing>
           <wp:inline distT="0" distB="0" distL="0" distR="0" wp14:anchorId="021B4F22" wp14:editId="3FB1C13D">
             <wp:extent cx="5943600" cy="1724660"/>
@@ -927,6 +937,9 @@
     </w:p>
     <w:p>
       <w:r>
+        <w:rPr>
+          <w:noProof/>
+        </w:rPr>
         <w:lastRenderedPageBreak/>
         <w:drawing>
           <wp:inline distT="0" distB="0" distL="0" distR="0" wp14:anchorId="1EF714B1" wp14:editId="2CA4F4C8">
@@ -953,6 +966,426 @@
                     <a:xfrm>
                       <a:off x="0" y="0"/>
                       <a:ext cx="5943600" cy="2135505"/>
+                    </a:xfrm>
+                    <a:prstGeom prst="rect">
+                      <a:avLst/>
+                    </a:prstGeom>
+                  </pic:spPr>
+                </pic:pic>
+              </a:graphicData>
+            </a:graphic>
+          </wp:inline>
+        </w:drawing>
+      </w:r>
+    </w:p>
+    <w:p>
+      <w:r>
+        <w:t>feat(platform): bootstrap EKS cluster with Metrics Server and Pod Identity Agent</w:t>
+      </w:r>
+    </w:p>
+    <w:p>
+      <w:r>
+        <w:rPr>
+          <w:highlight w:val="yellow"/>
+        </w:rPr>
+        <w:t>Install metrics server:</w:t>
+      </w:r>
+    </w:p>
+    <w:p>
+      <w:r>
+        <w:rPr>
+          <w:noProof/>
+        </w:rPr>
+        <w:drawing>
+          <wp:inline distT="0" distB="0" distL="0" distR="0" wp14:anchorId="5EBAC435" wp14:editId="70C44B38">
+            <wp:extent cx="5943600" cy="5181600"/>
+            <wp:effectExtent l="0" t="0" r="0" b="0"/>
+            <wp:docPr id="1379484640" name="Picture 1"/>
+            <wp:cNvGraphicFramePr>
+              <a:graphicFrameLocks xmlns:a="http://schemas.openxmlformats.org/drawingml/2006/main" noChangeAspect="1"/>
+            </wp:cNvGraphicFramePr>
+            <a:graphic xmlns:a="http://schemas.openxmlformats.org/drawingml/2006/main">
+              <a:graphicData uri="http://schemas.openxmlformats.org/drawingml/2006/picture">
+                <pic:pic xmlns:pic="http://schemas.openxmlformats.org/drawingml/2006/picture">
+                  <pic:nvPicPr>
+                    <pic:cNvPr id="1379484640" name=""/>
+                    <pic:cNvPicPr/>
+                  </pic:nvPicPr>
+                  <pic:blipFill>
+                    <a:blip r:embed="rId19"/>
+                    <a:stretch>
+                      <a:fillRect/>
+                    </a:stretch>
+                  </pic:blipFill>
+                  <pic:spPr>
+                    <a:xfrm>
+                      <a:off x="0" y="0"/>
+                      <a:ext cx="5943600" cy="5181600"/>
+                    </a:xfrm>
+                    <a:prstGeom prst="rect">
+                      <a:avLst/>
+                    </a:prstGeom>
+                  </pic:spPr>
+                </pic:pic>
+              </a:graphicData>
+            </a:graphic>
+          </wp:inline>
+        </w:drawing>
+      </w:r>
+    </w:p>
+    <w:p>
+      <w:r>
+        <w:rPr>
+          <w:noProof/>
+        </w:rPr>
+        <w:lastRenderedPageBreak/>
+        <w:drawing>
+          <wp:inline distT="0" distB="0" distL="0" distR="0" wp14:anchorId="40E23F0F" wp14:editId="72D74573">
+            <wp:extent cx="5943600" cy="2731135"/>
+            <wp:effectExtent l="0" t="0" r="0" b="0"/>
+            <wp:docPr id="227638242" name="Picture 1"/>
+            <wp:cNvGraphicFramePr>
+              <a:graphicFrameLocks xmlns:a="http://schemas.openxmlformats.org/drawingml/2006/main" noChangeAspect="1"/>
+            </wp:cNvGraphicFramePr>
+            <a:graphic xmlns:a="http://schemas.openxmlformats.org/drawingml/2006/main">
+              <a:graphicData uri="http://schemas.openxmlformats.org/drawingml/2006/picture">
+                <pic:pic xmlns:pic="http://schemas.openxmlformats.org/drawingml/2006/picture">
+                  <pic:nvPicPr>
+                    <pic:cNvPr id="227638242" name=""/>
+                    <pic:cNvPicPr/>
+                  </pic:nvPicPr>
+                  <pic:blipFill>
+                    <a:blip r:embed="rId20"/>
+                    <a:stretch>
+                      <a:fillRect/>
+                    </a:stretch>
+                  </pic:blipFill>
+                  <pic:spPr>
+                    <a:xfrm>
+                      <a:off x="0" y="0"/>
+                      <a:ext cx="5943600" cy="2731135"/>
+                    </a:xfrm>
+                    <a:prstGeom prst="rect">
+                      <a:avLst/>
+                    </a:prstGeom>
+                  </pic:spPr>
+                </pic:pic>
+              </a:graphicData>
+            </a:graphic>
+          </wp:inline>
+        </w:drawing>
+      </w:r>
+    </w:p>
+    <w:p>
+      <w:r>
+        <w:t>P</w:t>
+      </w:r>
+      <w:r>
+        <w:t xml:space="preserve">od Identity Agent </w:t>
+      </w:r>
+      <w:r>
+        <w:t xml:space="preserve">installed and running as a </w:t>
+      </w:r>
+      <w:proofErr w:type="spellStart"/>
+      <w:r>
+        <w:t>daemonset</w:t>
+      </w:r>
+      <w:proofErr w:type="spellEnd"/>
+      <w:r>
+        <w:t xml:space="preserve"> on each node in the cluster</w:t>
+      </w:r>
+      <w:r>
+        <w:t xml:space="preserve"> for secured workload identity to AWS resources.</w:t>
+      </w:r>
+    </w:p>
+    <w:p>
+      <w:r>
+        <w:rPr>
+          <w:noProof/>
+        </w:rPr>
+        <w:drawing>
+          <wp:inline distT="0" distB="0" distL="0" distR="0" wp14:anchorId="1626D5B2" wp14:editId="3C176A85">
+            <wp:extent cx="5943600" cy="3124200"/>
+            <wp:effectExtent l="0" t="0" r="0" b="0"/>
+            <wp:docPr id="1792231085" name="Picture 1"/>
+            <wp:cNvGraphicFramePr>
+              <a:graphicFrameLocks xmlns:a="http://schemas.openxmlformats.org/drawingml/2006/main" noChangeAspect="1"/>
+            </wp:cNvGraphicFramePr>
+            <a:graphic xmlns:a="http://schemas.openxmlformats.org/drawingml/2006/main">
+              <a:graphicData uri="http://schemas.openxmlformats.org/drawingml/2006/picture">
+                <pic:pic xmlns:pic="http://schemas.openxmlformats.org/drawingml/2006/picture">
+                  <pic:nvPicPr>
+                    <pic:cNvPr id="1792231085" name=""/>
+                    <pic:cNvPicPr/>
+                  </pic:nvPicPr>
+                  <pic:blipFill>
+                    <a:blip r:embed="rId21"/>
+                    <a:stretch>
+                      <a:fillRect/>
+                    </a:stretch>
+                  </pic:blipFill>
+                  <pic:spPr>
+                    <a:xfrm>
+                      <a:off x="0" y="0"/>
+                      <a:ext cx="5943600" cy="3124200"/>
+                    </a:xfrm>
+                    <a:prstGeom prst="rect">
+                      <a:avLst/>
+                    </a:prstGeom>
+                  </pic:spPr>
+                </pic:pic>
+              </a:graphicData>
+            </a:graphic>
+          </wp:inline>
+        </w:drawing>
+      </w:r>
+    </w:p>
+    <w:p>
+      <w:r>
+        <w:t xml:space="preserve">Pod Identity Association </w:t>
+      </w:r>
+      <w:r>
+        <w:t xml:space="preserve">for </w:t>
+      </w:r>
+      <w:proofErr w:type="spellStart"/>
+      <w:r>
+        <w:t>ebs</w:t>
+      </w:r>
+      <w:proofErr w:type="spellEnd"/>
+      <w:r>
+        <w:t>-</w:t>
+      </w:r>
+      <w:proofErr w:type="spellStart"/>
+      <w:r>
+        <w:t>csi</w:t>
+      </w:r>
+      <w:proofErr w:type="spellEnd"/>
+      <w:r>
+        <w:t>-driver</w:t>
+      </w:r>
+    </w:p>
+    <w:p>
+      <w:r>
+        <w:rPr>
+          <w:noProof/>
+        </w:rPr>
+        <w:lastRenderedPageBreak/>
+        <w:drawing>
+          <wp:inline distT="0" distB="0" distL="0" distR="0" wp14:anchorId="26AC9767" wp14:editId="0CC77E12">
+            <wp:extent cx="5943600" cy="3057525"/>
+            <wp:effectExtent l="0" t="0" r="0" b="9525"/>
+            <wp:docPr id="1347136545" name="Picture 1"/>
+            <wp:cNvGraphicFramePr>
+              <a:graphicFrameLocks xmlns:a="http://schemas.openxmlformats.org/drawingml/2006/main" noChangeAspect="1"/>
+            </wp:cNvGraphicFramePr>
+            <a:graphic xmlns:a="http://schemas.openxmlformats.org/drawingml/2006/main">
+              <a:graphicData uri="http://schemas.openxmlformats.org/drawingml/2006/picture">
+                <pic:pic xmlns:pic="http://schemas.openxmlformats.org/drawingml/2006/picture">
+                  <pic:nvPicPr>
+                    <pic:cNvPr id="1347136545" name=""/>
+                    <pic:cNvPicPr/>
+                  </pic:nvPicPr>
+                  <pic:blipFill>
+                    <a:blip r:embed="rId22"/>
+                    <a:stretch>
+                      <a:fillRect/>
+                    </a:stretch>
+                  </pic:blipFill>
+                  <pic:spPr>
+                    <a:xfrm>
+                      <a:off x="0" y="0"/>
+                      <a:ext cx="5943600" cy="3057525"/>
+                    </a:xfrm>
+                    <a:prstGeom prst="rect">
+                      <a:avLst/>
+                    </a:prstGeom>
+                  </pic:spPr>
+                </pic:pic>
+              </a:graphicData>
+            </a:graphic>
+          </wp:inline>
+        </w:drawing>
+      </w:r>
+    </w:p>
+    <w:p>
+      <w:r>
+        <w:rPr>
+          <w:noProof/>
+        </w:rPr>
+        <w:drawing>
+          <wp:inline distT="0" distB="0" distL="0" distR="0" wp14:anchorId="7CBE9398" wp14:editId="55172603">
+            <wp:extent cx="5943600" cy="2396490"/>
+            <wp:effectExtent l="0" t="0" r="0" b="3810"/>
+            <wp:docPr id="102131770" name="Picture 1"/>
+            <wp:cNvGraphicFramePr>
+              <a:graphicFrameLocks xmlns:a="http://schemas.openxmlformats.org/drawingml/2006/main" noChangeAspect="1"/>
+            </wp:cNvGraphicFramePr>
+            <a:graphic xmlns:a="http://schemas.openxmlformats.org/drawingml/2006/main">
+              <a:graphicData uri="http://schemas.openxmlformats.org/drawingml/2006/picture">
+                <pic:pic xmlns:pic="http://schemas.openxmlformats.org/drawingml/2006/picture">
+                  <pic:nvPicPr>
+                    <pic:cNvPr id="102131770" name=""/>
+                    <pic:cNvPicPr/>
+                  </pic:nvPicPr>
+                  <pic:blipFill>
+                    <a:blip r:embed="rId23"/>
+                    <a:stretch>
+                      <a:fillRect/>
+                    </a:stretch>
+                  </pic:blipFill>
+                  <pic:spPr>
+                    <a:xfrm>
+                      <a:off x="0" y="0"/>
+                      <a:ext cx="5943600" cy="2396490"/>
+                    </a:xfrm>
+                    <a:prstGeom prst="rect">
+                      <a:avLst/>
+                    </a:prstGeom>
+                  </pic:spPr>
+                </pic:pic>
+              </a:graphicData>
+            </a:graphic>
+          </wp:inline>
+        </w:drawing>
+      </w:r>
+    </w:p>
+    <w:p>
+      <w:r>
+        <w:rPr>
+          <w:noProof/>
+        </w:rPr>
+        <w:drawing>
+          <wp:inline distT="0" distB="0" distL="0" distR="0" wp14:anchorId="273BDD94" wp14:editId="497650DF">
+            <wp:extent cx="5943600" cy="1479550"/>
+            <wp:effectExtent l="0" t="0" r="0" b="6350"/>
+            <wp:docPr id="521392644" name="Picture 1"/>
+            <wp:cNvGraphicFramePr>
+              <a:graphicFrameLocks xmlns:a="http://schemas.openxmlformats.org/drawingml/2006/main" noChangeAspect="1"/>
+            </wp:cNvGraphicFramePr>
+            <a:graphic xmlns:a="http://schemas.openxmlformats.org/drawingml/2006/main">
+              <a:graphicData uri="http://schemas.openxmlformats.org/drawingml/2006/picture">
+                <pic:pic xmlns:pic="http://schemas.openxmlformats.org/drawingml/2006/picture">
+                  <pic:nvPicPr>
+                    <pic:cNvPr id="521392644" name=""/>
+                    <pic:cNvPicPr/>
+                  </pic:nvPicPr>
+                  <pic:blipFill>
+                    <a:blip r:embed="rId24"/>
+                    <a:stretch>
+                      <a:fillRect/>
+                    </a:stretch>
+                  </pic:blipFill>
+                  <pic:spPr>
+                    <a:xfrm>
+                      <a:off x="0" y="0"/>
+                      <a:ext cx="5943600" cy="1479550"/>
+                    </a:xfrm>
+                    <a:prstGeom prst="rect">
+                      <a:avLst/>
+                    </a:prstGeom>
+                  </pic:spPr>
+                </pic:pic>
+              </a:graphicData>
+            </a:graphic>
+          </wp:inline>
+        </w:drawing>
+      </w:r>
+    </w:p>
+    <w:p>
+      <w:r>
+        <w:rPr>
+          <w:noProof/>
+        </w:rPr>
+        <w:lastRenderedPageBreak/>
+        <w:drawing>
+          <wp:inline distT="0" distB="0" distL="0" distR="0" wp14:anchorId="65168CED" wp14:editId="2888BE34">
+            <wp:extent cx="5943600" cy="3441065"/>
+            <wp:effectExtent l="0" t="0" r="0" b="6985"/>
+            <wp:docPr id="1670885193" name="Picture 1"/>
+            <wp:cNvGraphicFramePr>
+              <a:graphicFrameLocks xmlns:a="http://schemas.openxmlformats.org/drawingml/2006/main" noChangeAspect="1"/>
+            </wp:cNvGraphicFramePr>
+            <a:graphic xmlns:a="http://schemas.openxmlformats.org/drawingml/2006/main">
+              <a:graphicData uri="http://schemas.openxmlformats.org/drawingml/2006/picture">
+                <pic:pic xmlns:pic="http://schemas.openxmlformats.org/drawingml/2006/picture">
+                  <pic:nvPicPr>
+                    <pic:cNvPr id="1670885193" name=""/>
+                    <pic:cNvPicPr/>
+                  </pic:nvPicPr>
+                  <pic:blipFill>
+                    <a:blip r:embed="rId25"/>
+                    <a:stretch>
+                      <a:fillRect/>
+                    </a:stretch>
+                  </pic:blipFill>
+                  <pic:spPr>
+                    <a:xfrm>
+                      <a:off x="0" y="0"/>
+                      <a:ext cx="5943600" cy="3441065"/>
+                    </a:xfrm>
+                    <a:prstGeom prst="rect">
+                      <a:avLst/>
+                    </a:prstGeom>
+                  </pic:spPr>
+                </pic:pic>
+              </a:graphicData>
+            </a:graphic>
+          </wp:inline>
+        </w:drawing>
+      </w:r>
+    </w:p>
+    <w:p/>
+    <w:p/>
+    <w:p/>
+    <w:p/>
+    <w:p/>
+    <w:p/>
+    <w:p/>
+    <w:p/>
+    <w:p/>
+    <w:p/>
+    <w:p/>
+    <w:p/>
+    <w:p/>
+    <w:p/>
+    <w:p/>
+    <w:p>
+      <w:r>
+        <w:lastRenderedPageBreak/>
+        <w:t>feat(storage): implement Amazon EBS CSI Driver with EKS Pod Identity</w:t>
+      </w:r>
+      <w:r>
+        <w:t xml:space="preserve"> </w:t>
+      </w:r>
+      <w:r>
+        <w:rPr>
+          <w:noProof/>
+        </w:rPr>
+        <w:drawing>
+          <wp:inline distT="0" distB="0" distL="0" distR="0" wp14:anchorId="34BA4621" wp14:editId="4A43F86B">
+            <wp:extent cx="5943600" cy="5429250"/>
+            <wp:effectExtent l="0" t="0" r="0" b="0"/>
+            <wp:docPr id="485355120" name="Picture 1"/>
+            <wp:cNvGraphicFramePr>
+              <a:graphicFrameLocks xmlns:a="http://schemas.openxmlformats.org/drawingml/2006/main" noChangeAspect="1"/>
+            </wp:cNvGraphicFramePr>
+            <a:graphic xmlns:a="http://schemas.openxmlformats.org/drawingml/2006/main">
+              <a:graphicData uri="http://schemas.openxmlformats.org/drawingml/2006/picture">
+                <pic:pic xmlns:pic="http://schemas.openxmlformats.org/drawingml/2006/picture">
+                  <pic:nvPicPr>
+                    <pic:cNvPr id="485355120" name=""/>
+                    <pic:cNvPicPr/>
+                  </pic:nvPicPr>
+                  <pic:blipFill>
+                    <a:blip r:embed="rId26"/>
+                    <a:stretch>
+                      <a:fillRect/>
+                    </a:stretch>
+                  </pic:blipFill>
+                  <pic:spPr>
+                    <a:xfrm>
+                      <a:off x="0" y="0"/>
+                      <a:ext cx="5943600" cy="5429250"/>
                     </a:xfrm>
                     <a:prstGeom prst="rect">
                       <a:avLst/>
@@ -1578,6 +2011,7 @@
   <w:style w:type="character" w:default="1" w:styleId="DefaultParagraphFont">
     <w:name w:val="Default Paragraph Font"/>
     <w:uiPriority w:val="1"/>
+    <w:semiHidden/>
     <w:unhideWhenUsed/>
   </w:style>
   <w:style w:type="table" w:default="1" w:styleId="TableNormal">

</xml_diff>

<commit_message>
feat(storage): implement Amazon EBS CSI Driver with Pod Identity and dynamic gp3 provisioning
</commit_message>
<xml_diff>
--- a/docs/retail-store-v2-validation-screenshots.docx
+++ b/docs/retail-store-v2-validation-screenshots.docx
@@ -12,16 +12,21 @@
         <w:rPr>
           <w:color w:val="EE0000"/>
         </w:rPr>
-        <w:t xml:space="preserve">feat: add Retail Store v2 application source and production </w:t>
-      </w:r>
-      <w:proofErr w:type="spellStart"/>
-      <w:r>
+        <w:t>feat: add Retail Store v2 application source and production Dockerfiles</w:t>
+      </w:r>
+    </w:p>
+    <w:p>
+      <w:pPr>
         <w:rPr>
           <w:color w:val="EE0000"/>
         </w:rPr>
-        <w:t>Dockerfiles</w:t>
-      </w:r>
-      <w:proofErr w:type="spellEnd"/>
+      </w:pPr>
+      <w:r>
+        <w:rPr>
+          <w:color w:val="EE0000"/>
+        </w:rPr>
+        <w:t>- Add Retail Store v2 application source code</w:t>
+      </w:r>
     </w:p>
     <w:p>
       <w:pPr>
@@ -33,29 +38,8 @@
         <w:rPr>
           <w:color w:val="EE0000"/>
         </w:rPr>
-        <w:t>- Add Retail Store v2 application source code</w:t>
-      </w:r>
-    </w:p>
-    <w:p>
-      <w:pPr>
-        <w:rPr>
-          <w:color w:val="EE0000"/>
-        </w:rPr>
-      </w:pPr>
-      <w:r>
-        <w:rPr>
-          <w:color w:val="EE0000"/>
-        </w:rPr>
-        <w:t xml:space="preserve">- Implement production-grade multi-stage </w:t>
-      </w:r>
-      <w:proofErr w:type="spellStart"/>
-      <w:r>
-        <w:rPr>
-          <w:color w:val="EE0000"/>
-        </w:rPr>
-        <w:t>Dockerfiles</w:t>
-      </w:r>
-      <w:proofErr w:type="spellEnd"/>
+        <w:t>- Implement production-grade multi-stage Dockerfiles</w:t>
+      </w:r>
     </w:p>
     <w:p>
       <w:pPr>
@@ -130,25 +114,7 @@
           <w:bCs/>
           <w:highlight w:val="yellow"/>
         </w:rPr>
-        <w:t xml:space="preserve">Docker </w:t>
-      </w:r>
-      <w:proofErr w:type="gramStart"/>
-      <w:r>
-        <w:rPr>
-          <w:b/>
-          <w:bCs/>
-          <w:highlight w:val="yellow"/>
-        </w:rPr>
-        <w:t>compose</w:t>
-      </w:r>
-      <w:proofErr w:type="gramEnd"/>
-      <w:r>
-        <w:rPr>
-          <w:b/>
-          <w:bCs/>
-          <w:highlight w:val="yellow"/>
-        </w:rPr>
-        <w:t xml:space="preserve"> implementation</w:t>
+        <w:t>Docker compose implementation</w:t>
       </w:r>
       <w:r>
         <w:rPr>
@@ -330,13 +296,8 @@
       </w:r>
     </w:p>
     <w:p>
-      <w:proofErr w:type="gramStart"/>
-      <w:r>
-        <w:t>Remote-state</w:t>
-      </w:r>
-      <w:proofErr w:type="gramEnd"/>
-      <w:r>
-        <w:t xml:space="preserve"> s3</w:t>
+      <w:r>
+        <w:t>Remote-state s3</w:t>
       </w:r>
       <w:r>
         <w:t>: Use remote backend state file for team collaboration to maintain the state of your cloud infrastructure</w:t>
@@ -353,23 +314,7 @@
     </w:p>
     <w:p>
       <w:r>
-        <w:t xml:space="preserve">State </w:t>
-      </w:r>
-      <w:proofErr w:type="gramStart"/>
-      <w:r>
-        <w:t>file is</w:t>
-      </w:r>
-      <w:proofErr w:type="gramEnd"/>
-      <w:r>
-        <w:t xml:space="preserve"> also used by EKS </w:t>
-      </w:r>
-      <w:proofErr w:type="gramStart"/>
-      <w:r>
-        <w:t>cluster</w:t>
-      </w:r>
-      <w:proofErr w:type="gramEnd"/>
-      <w:r>
-        <w:t xml:space="preserve"> to get the VPC ID of where to create private worker nodes in.</w:t>
+        <w:t>State file is also used by EKS cluster to get the VPC ID of where to create private worker nodes in.</w:t>
       </w:r>
     </w:p>
     <w:p>
@@ -510,15 +455,7 @@
     <w:p>
       <w:r>
         <w:lastRenderedPageBreak/>
-        <w:t>"</w:t>
-      </w:r>
-      <w:proofErr w:type="gramStart"/>
-      <w:r>
-        <w:t>feat</w:t>
-      </w:r>
-      <w:proofErr w:type="gramEnd"/>
-      <w:r>
-        <w:t>(terraform): provision production networking foundation"</w:t>
+        <w:t>"feat(terraform): provision production networking foundation"</w:t>
       </w:r>
       <w:r>
         <w:br/>
@@ -732,14 +669,12 @@
           <w:noProof/>
         </w:rPr>
       </w:pPr>
-      <w:proofErr w:type="spellStart"/>
       <w:r>
         <w:rPr>
           <w:highlight w:val="yellow"/>
         </w:rPr>
         <w:t>igw</w:t>
       </w:r>
-      <w:proofErr w:type="spellEnd"/>
       <w:r>
         <w:rPr>
           <w:noProof/>
@@ -1084,15 +1019,7 @@
         <w:t xml:space="preserve">od Identity Agent </w:t>
       </w:r>
       <w:r>
-        <w:t xml:space="preserve">installed and running as a </w:t>
-      </w:r>
-      <w:proofErr w:type="spellStart"/>
-      <w:r>
-        <w:t>daemonset</w:t>
-      </w:r>
-      <w:proofErr w:type="spellEnd"/>
-      <w:r>
-        <w:t xml:space="preserve"> on each node in the cluster</w:t>
+        <w:t>installed and running as a daemonset on each node in the cluster</w:t>
       </w:r>
       <w:r>
         <w:t xml:space="preserve"> for secured workload identity to AWS resources.</w:t>
@@ -1147,21 +1074,8 @@
       <w:r>
         <w:t xml:space="preserve">for </w:t>
       </w:r>
-      <w:proofErr w:type="spellStart"/>
-      <w:r>
-        <w:t>ebs</w:t>
-      </w:r>
-      <w:proofErr w:type="spellEnd"/>
-      <w:r>
-        <w:t>-</w:t>
-      </w:r>
-      <w:proofErr w:type="spellStart"/>
-      <w:r>
-        <w:t>csi</w:t>
-      </w:r>
-      <w:proofErr w:type="spellEnd"/>
-      <w:r>
-        <w:t>-driver</w:t>
+      <w:r>
+        <w:t>ebs-csi-driver</w:t>
       </w:r>
     </w:p>
     <w:p>
@@ -1352,10 +1266,7 @@
     <w:p>
       <w:r>
         <w:lastRenderedPageBreak/>
-        <w:t>feat(storage): implement Amazon EBS CSI Driver with EKS Pod Identity</w:t>
-      </w:r>
-      <w:r>
-        <w:t xml:space="preserve"> </w:t>
+        <w:t xml:space="preserve">feat(storage): implement Amazon EBS CSI Driver with EKS Pod Identity </w:t>
       </w:r>
       <w:r>
         <w:rPr>
@@ -1386,6 +1297,51 @@
                     <a:xfrm>
                       <a:off x="0" y="0"/>
                       <a:ext cx="5943600" cy="5429250"/>
+                    </a:xfrm>
+                    <a:prstGeom prst="rect">
+                      <a:avLst/>
+                    </a:prstGeom>
+                  </pic:spPr>
+                </pic:pic>
+              </a:graphicData>
+            </a:graphic>
+          </wp:inline>
+        </w:drawing>
+      </w:r>
+    </w:p>
+    <w:p>
+      <w:r>
+        <w:br/>
+        <w:t>feat(storage): implement Amazon EBS CSI Driver with Pod Identity and dynamic gp3 provisioning</w:t>
+      </w:r>
+    </w:p>
+    <w:p>
+      <w:r>
+        <w:drawing>
+          <wp:inline distT="0" distB="0" distL="0" distR="0" wp14:anchorId="58575F51" wp14:editId="58B29293">
+            <wp:extent cx="5943600" cy="1485900"/>
+            <wp:effectExtent l="0" t="0" r="0" b="0"/>
+            <wp:docPr id="1243691762" name="Picture 1"/>
+            <wp:cNvGraphicFramePr>
+              <a:graphicFrameLocks xmlns:a="http://schemas.openxmlformats.org/drawingml/2006/main" noChangeAspect="1"/>
+            </wp:cNvGraphicFramePr>
+            <a:graphic xmlns:a="http://schemas.openxmlformats.org/drawingml/2006/main">
+              <a:graphicData uri="http://schemas.openxmlformats.org/drawingml/2006/picture">
+                <pic:pic xmlns:pic="http://schemas.openxmlformats.org/drawingml/2006/picture">
+                  <pic:nvPicPr>
+                    <pic:cNvPr id="1243691762" name=""/>
+                    <pic:cNvPicPr/>
+                  </pic:nvPicPr>
+                  <pic:blipFill>
+                    <a:blip r:embed="rId27"/>
+                    <a:stretch>
+                      <a:fillRect/>
+                    </a:stretch>
+                  </pic:blipFill>
+                  <pic:spPr>
+                    <a:xfrm>
+                      <a:off x="0" y="0"/>
+                      <a:ext cx="5943600" cy="1485900"/>
                     </a:xfrm>
                     <a:prstGeom prst="rect">
                       <a:avLst/>
@@ -2011,7 +1967,6 @@
   <w:style w:type="character" w:default="1" w:styleId="DefaultParagraphFont">
     <w:name w:val="Default Paragraph Font"/>
     <w:uiPriority w:val="1"/>
-    <w:semiHidden/>
     <w:unhideWhenUsed/>
   </w:style>
   <w:style w:type="table" w:default="1" w:styleId="TableNormal">

</xml_diff>